<commit_message>
Pasar a la fuente las ediciones manuales de los entregables
Traslada a los .md y a los scripts de build lo que Nahuel editó a mano
en Word (96b152d), para que no se pierda al regenerar:
- Relevamiento: sin marcas ❌/✅ en el alcance (las filtra el build),
  Figura 1 al 95 % y leyenda sin énfasis.
- Requisitos: introducción sin «de la consulta a la venta» ni la mención
  a PC1; «(transversal)» sin cursiva en RF-151 a RF-153.
- Plantilla compartida: índice titulado «Índice» y pie con el número de
  página solo, sin guiones.

Se regeneran reference.docx y los .docx de Relevamiento y Requisitos.
El de Casos de uso no se regenera: filtra marcas internas de los CU
(anotado como pendiente).

Co-Authored-By: Claude Opus 5.5 <noreply@anthropic.com>
</commit_message>
<xml_diff>
--- a/07-Entregables/build/reference.docx
+++ b/07-Entregables/build/reference.docx
@@ -342,28 +342,7 @@
         <w:sz w:val="18"/>
         <w:szCs w:val="18"/>
       </w:rPr>
-      <w:t xml:space="preserve">â€” </w:t>
-    </w:r>
-    <w:r>
-      <w:rPr>
-        <w:color w:val="808080"/>
-        <w:sz w:val="18"/>
-      </w:rPr>
       <w:fldChar w:fldCharType="begin"/>
-    </w:r>
-    <w:r>
-      <w:rPr>
-        <w:color w:val="808080"/>
-        <w:sz w:val="18"/>
-      </w:rPr>
-      <w:instrText xml:space="preserve"> PAGE </w:instrText>
-    </w:r>
-    <w:r>
-      <w:rPr>
-        <w:color w:val="808080"/>
-        <w:sz w:val="18"/>
-      </w:rPr>
-      <w:fldChar w:fldCharType="end"/>
     </w:r>
     <w:r>
       <w:rPr>
@@ -372,7 +351,34 @@
         <w:sz w:val="18"/>
         <w:szCs w:val="18"/>
       </w:rPr>
-      <w:t xml:space="preserve"> â€”</w:t>
+      <w:instrText xml:space="preserve"> PAGE </w:instrText>
+    </w:r>
+    <w:r>
+      <w:rPr>
+        <w:rFonts w:ascii="Cambria" w:hAnsi="Cambria"/>
+        <w:color w:val="808080"/>
+        <w:sz w:val="18"/>
+        <w:szCs w:val="18"/>
+      </w:rPr>
+      <w:fldChar w:fldCharType="separate"/>
+    </w:r>
+    <w:r>
+      <w:rPr>
+        <w:rFonts w:ascii="Cambria" w:hAnsi="Cambria"/>
+        <w:color w:val="808080"/>
+        <w:sz w:val="18"/>
+        <w:szCs w:val="18"/>
+      </w:rPr>
+      <w:t>1</w:t>
+    </w:r>
+    <w:r>
+      <w:rPr>
+        <w:rFonts w:ascii="Cambria" w:hAnsi="Cambria"/>
+        <w:color w:val="808080"/>
+        <w:sz w:val="18"/>
+        <w:szCs w:val="18"/>
+      </w:rPr>
+      <w:fldChar w:fldCharType="end"/>
     </w:r>
   </w:p>
 </w:ftr>

</xml_diff>